<commit_message>
feat: implementar ciclo real de faturas
</commit_message>
<xml_diff>
--- a/DOCUMENTAÇÃO DO SISTEMA CONTROLE FINANCEIRO.docx
+++ b/DOCUMENTAÇÃO DO SISTEMA CONTROLE FINANCEIRO.docx
@@ -35,10 +35,10 @@
         <w:t xml:space="preserve"> </w:t>
       </w:r>
       <w:r>
-        <w:t xml:space="preserve">2.1.0-test.8</w:t>
-      </w:r>
-      <w:r>
-        <w:br/>
+        <w:t xml:space="preserve">2.1.0-test.9</w:t>
+      </w:r>
+      <w:r>
+        <w:t xml:space="preserve"> </w:t>
       </w:r>
       <w:r>
         <w:rPr>
@@ -92,7 +92,7 @@
           <w:rPr>
             <w:rStyle w:val="Hyperlink"/>
           </w:rPr>
-          <w:t xml:space="preserve">https://github.com/boente66/Finance_Assist/releases/tag/v2.1.0-test.8</w:t>
+          <w:t xml:space="preserve">https://github.com/boente66/Finance_Assist/releases/tag/v2.1.0-test.9</w:t>
         </w:r>
       </w:hyperlink>
     </w:p>
@@ -556,7 +556,117 @@
         <w:t xml:space="preserve"> </w:t>
       </w:r>
       <w:r>
-        <w:t xml:space="preserve">disponível, total da fatura, lançamentos abertos e pagos.</w:t>
+        <w:t xml:space="preserve">disponível e separa compras, créditos, pagamentos e saldo a pagar.</w:t>
+      </w:r>
+    </w:p>
+    <w:p>
+      <w:pPr>
+        <w:pStyle w:val="Corpodetexto"/>
+      </w:pPr>
+      <w:r>
+        <w:t xml:space="preserve">A fatura passa por</w:t>
+      </w:r>
+      <w:r>
+        <w:t xml:space="preserve"> </w:t>
+      </w:r>
+      <w:r>
+        <w:rPr>
+          <w:bCs/>
+          <w:b/>
+        </w:rPr>
+        <w:t xml:space="preserve">ABERTA</w:t>
+      </w:r>
+      <w:r>
+        <w:t xml:space="preserve">,</w:t>
+      </w:r>
+      <w:r>
+        <w:t xml:space="preserve"> </w:t>
+      </w:r>
+      <w:r>
+        <w:rPr>
+          <w:bCs/>
+          <w:b/>
+        </w:rPr>
+        <w:t xml:space="preserve">FECHADA</w:t>
+      </w:r>
+      <w:r>
+        <w:t xml:space="preserve"> </w:t>
+      </w:r>
+      <w:r>
+        <w:t xml:space="preserve">e</w:t>
+      </w:r>
+      <w:r>
+        <w:t xml:space="preserve"> </w:t>
+      </w:r>
+      <w:r>
+        <w:rPr>
+          <w:bCs/>
+          <w:b/>
+        </w:rPr>
+        <w:t xml:space="preserve">PAGA</w:t>
+      </w:r>
+      <w:r>
+        <w:t xml:space="preserve">. A fatura aberta recebe as</w:t>
+      </w:r>
+      <w:r>
+        <w:t xml:space="preserve"> </w:t>
+      </w:r>
+      <w:r>
+        <w:t xml:space="preserve">compras atuais. No fechamento ela para de receber compras, continua pendente e</w:t>
+      </w:r>
+      <w:r>
+        <w:t xml:space="preserve"> </w:t>
+      </w:r>
+      <w:r>
+        <w:t xml:space="preserve">o sistema abre a competência seguinte. O pagamento cria uma linha negativa na</w:t>
+      </w:r>
+      <w:r>
+        <w:t xml:space="preserve"> </w:t>
+      </w:r>
+      <w:r>
+        <w:t xml:space="preserve">fatura e uma saída negativa na conta escolhida; ele não modifica nem apaga as</w:t>
+      </w:r>
+      <w:r>
+        <w:t xml:space="preserve"> </w:t>
+      </w:r>
+      <w:r>
+        <w:t xml:space="preserve">compras positivas do histórico.</w:t>
+      </w:r>
+    </w:p>
+    <w:p>
+      <w:pPr>
+        <w:pStyle w:val="Corpodetexto"/>
+      </w:pPr>
+      <w:r>
+        <w:t xml:space="preserve">Use</w:t>
+      </w:r>
+      <w:r>
+        <w:t xml:space="preserve"> </w:t>
+      </w:r>
+      <w:r>
+        <w:rPr>
+          <w:bCs/>
+          <w:b/>
+        </w:rPr>
+        <w:t xml:space="preserve">Adicionar crédito</w:t>
+      </w:r>
+      <w:r>
+        <w:t xml:space="preserve"> </w:t>
+      </w:r>
+      <w:r>
+        <w:t xml:space="preserve">para cashback, estorno, devolução, desconto ou ajuste.</w:t>
+      </w:r>
+      <w:r>
+        <w:t xml:space="preserve"> </w:t>
+      </w:r>
+      <w:r>
+        <w:t xml:space="preserve">Informe um valor positivo: o sistema o exibe como redução negativa na fatura e</w:t>
+      </w:r>
+      <w:r>
+        <w:t xml:space="preserve"> </w:t>
+      </w:r>
+      <w:r>
+        <w:t xml:space="preserve">recompõe o limite. No estorno, a compra original permanece registrada.</w:t>
       </w:r>
     </w:p>
     <w:bookmarkStart w:id="30" w:name="importação-de-faturas"/>
@@ -1021,7 +1131,7 @@
         <w:pStyle w:val="Compact"/>
       </w:pPr>
       <w:r>
-        <w:t xml:space="preserve">Baixe finance-assist_2.1.0-test.8_windows-x64.zip.</w:t>
+        <w:t xml:space="preserve">Baixe finance-assist_2.1.0-test.9_windows-x64.zip.</w:t>
       </w:r>
     </w:p>
     <w:p>
@@ -1074,7 +1184,7 @@
         <w:rPr>
           <w:rStyle w:val="VerbatimChar"/>
         </w:rPr>
-        <w:t xml:space="preserve">sudo apt install ./finance-assist_2.1.0-test.8_amd64.deb</w:t>
+        <w:t xml:space="preserve">sudo apt install ./finance-assist_2.1.0-test.9_amd64.deb</w:t>
       </w:r>
     </w:p>
     <w:p>
@@ -1377,7 +1487,7 @@
         <w:pStyle w:val="Compact"/>
       </w:pPr>
       <w:r>
-        <w:t xml:space="preserve">Versão test.8:</w:t>
+        <w:t xml:space="preserve">Versão test.9:</w:t>
       </w:r>
       <w:r>
         <w:t xml:space="preserve"> </w:t>
@@ -1387,7 +1497,7 @@
           <w:rPr>
             <w:rStyle w:val="Hyperlink"/>
           </w:rPr>
-          <w:t xml:space="preserve">https://github.com/boente66/Finance_Assist/releases/tag/v2.1.0-test.8</w:t>
+          <w:t xml:space="preserve">https://github.com/boente66/Finance_Assist/releases/tag/v2.1.0-test.9</w:t>
         </w:r>
       </w:hyperlink>
     </w:p>
@@ -1419,7 +1529,7 @@
         <w:pStyle w:val="FirstParagraph"/>
       </w:pPr>
       <w:r>
-        <w:t xml:space="preserve">A versão 2.1.0-test.8 foi validada com 246 testes automatizados. Os instaladores</w:t>
+        <w:t xml:space="preserve">A versão 2.1.0-test.9 foi validada com 251 testes automatizados. Os instaladores</w:t>
       </w:r>
       <w:r>
         <w:t xml:space="preserve"> </w:t>
@@ -9013,13 +9123,465 @@
       <w:bCs/>
     </w:rPr>
   </w:style>
-  <w:style w:type="paragraph" w:customStyle="1" w:styleId="SourceCode">
+  <w:style w:customStyle="1" w:styleId="SourceCode" w:type="paragraph">
     <w:name w:val="Source Code"/>
     <w:basedOn w:val="Normal"/>
     <w:link w:val="VerbatimChar"/>
     <w:pPr>
       <w:wordWrap w:val="off"/>
     </w:pPr>
+  </w:style>
+  <w:style w:customStyle="1" w:styleId="KeywordTok" w:type="character">
+    <w:name w:val="KeywordTok"/>
+    <w:basedOn w:val="VerbatimChar"/>
+    <w:rPr>
+      <w:color w:val="007020"/>
+      <w:b/>
+    </w:rPr>
+  </w:style>
+  <w:style w:customStyle="1" w:styleId="DataTypeTok" w:type="character">
+    <w:name w:val="DataTypeTok"/>
+    <w:basedOn w:val="VerbatimChar"/>
+    <w:rPr>
+      <w:color w:val="902000"/>
+    </w:rPr>
+  </w:style>
+  <w:style w:customStyle="1" w:styleId="DecValTok" w:type="character">
+    <w:name w:val="DecValTok"/>
+    <w:basedOn w:val="VerbatimChar"/>
+    <w:rPr>
+      <w:color w:val="40a070"/>
+    </w:rPr>
+  </w:style>
+  <w:style w:customStyle="1" w:styleId="BaseNTok" w:type="character">
+    <w:name w:val="BaseNTok"/>
+    <w:basedOn w:val="VerbatimChar"/>
+    <w:rPr>
+      <w:color w:val="40a070"/>
+    </w:rPr>
+  </w:style>
+  <w:style w:customStyle="1" w:styleId="FloatTok" w:type="character">
+    <w:name w:val="FloatTok"/>
+    <w:basedOn w:val="VerbatimChar"/>
+    <w:rPr>
+      <w:color w:val="40a070"/>
+    </w:rPr>
+  </w:style>
+  <w:style w:customStyle="1" w:styleId="ConstantTok" w:type="character">
+    <w:name w:val="ConstantTok"/>
+    <w:basedOn w:val="VerbatimChar"/>
+    <w:rPr>
+      <w:color w:val="880000"/>
+    </w:rPr>
+  </w:style>
+  <w:style w:customStyle="1" w:styleId="CharTok" w:type="character">
+    <w:name w:val="CharTok"/>
+    <w:basedOn w:val="VerbatimChar"/>
+    <w:rPr>
+      <w:color w:val="4070a0"/>
+    </w:rPr>
+  </w:style>
+  <w:style w:customStyle="1" w:styleId="SpecialCharTok" w:type="character">
+    <w:name w:val="SpecialCharTok"/>
+    <w:basedOn w:val="VerbatimChar"/>
+    <w:rPr>
+      <w:color w:val="4070a0"/>
+    </w:rPr>
+  </w:style>
+  <w:style w:customStyle="1" w:styleId="StringTok" w:type="character">
+    <w:name w:val="StringTok"/>
+    <w:basedOn w:val="VerbatimChar"/>
+    <w:rPr>
+      <w:color w:val="4070a0"/>
+    </w:rPr>
+  </w:style>
+  <w:style w:customStyle="1" w:styleId="VerbatimStringTok" w:type="character">
+    <w:name w:val="VerbatimStringTok"/>
+    <w:basedOn w:val="VerbatimChar"/>
+    <w:rPr>
+      <w:color w:val="4070a0"/>
+    </w:rPr>
+  </w:style>
+  <w:style w:customStyle="1" w:styleId="SpecialStringTok" w:type="character">
+    <w:name w:val="SpecialStringTok"/>
+    <w:basedOn w:val="VerbatimChar"/>
+    <w:rPr>
+      <w:color w:val="bb6688"/>
+    </w:rPr>
+  </w:style>
+  <w:style w:customStyle="1" w:styleId="ImportTok" w:type="character">
+    <w:name w:val="ImportTok"/>
+    <w:basedOn w:val="VerbatimChar"/>
+    <w:rPr>
+      <w:color w:val="008000"/>
+      <w:b/>
+    </w:rPr>
+  </w:style>
+  <w:style w:customStyle="1" w:styleId="CommentTok" w:type="character">
+    <w:name w:val="CommentTok"/>
+    <w:basedOn w:val="VerbatimChar"/>
+    <w:rPr>
+      <w:color w:val="60a0b0"/>
+      <w:i/>
+    </w:rPr>
+  </w:style>
+  <w:style w:customStyle="1" w:styleId="DocumentationTok" w:type="character">
+    <w:name w:val="DocumentationTok"/>
+    <w:basedOn w:val="VerbatimChar"/>
+    <w:rPr>
+      <w:color w:val="ba2121"/>
+      <w:i/>
+    </w:rPr>
+  </w:style>
+  <w:style w:customStyle="1" w:styleId="AnnotationTok" w:type="character">
+    <w:name w:val="AnnotationTok"/>
+    <w:basedOn w:val="VerbatimChar"/>
+    <w:rPr>
+      <w:color w:val="60a0b0"/>
+      <w:b/>
+      <w:i/>
+    </w:rPr>
+  </w:style>
+  <w:style w:customStyle="1" w:styleId="CommentVarTok" w:type="character">
+    <w:name w:val="CommentVarTok"/>
+    <w:basedOn w:val="VerbatimChar"/>
+    <w:rPr>
+      <w:color w:val="60a0b0"/>
+      <w:b/>
+      <w:i/>
+    </w:rPr>
+  </w:style>
+  <w:style w:customStyle="1" w:styleId="OtherTok" w:type="character">
+    <w:name w:val="OtherTok"/>
+    <w:basedOn w:val="VerbatimChar"/>
+    <w:rPr>
+      <w:color w:val="007020"/>
+    </w:rPr>
+  </w:style>
+  <w:style w:customStyle="1" w:styleId="FunctionTok" w:type="character">
+    <w:name w:val="FunctionTok"/>
+    <w:basedOn w:val="VerbatimChar"/>
+    <w:rPr>
+      <w:color w:val="06287e"/>
+    </w:rPr>
+  </w:style>
+  <w:style w:customStyle="1" w:styleId="VariableTok" w:type="character">
+    <w:name w:val="VariableTok"/>
+    <w:basedOn w:val="VerbatimChar"/>
+    <w:rPr>
+      <w:color w:val="19177c"/>
+    </w:rPr>
+  </w:style>
+  <w:style w:customStyle="1" w:styleId="ControlFlowTok" w:type="character">
+    <w:name w:val="ControlFlowTok"/>
+    <w:basedOn w:val="VerbatimChar"/>
+    <w:rPr>
+      <w:color w:val="007020"/>
+      <w:b/>
+    </w:rPr>
+  </w:style>
+  <w:style w:customStyle="1" w:styleId="OperatorTok" w:type="character">
+    <w:name w:val="OperatorTok"/>
+    <w:basedOn w:val="VerbatimChar"/>
+    <w:rPr>
+      <w:color w:val="666666"/>
+    </w:rPr>
+  </w:style>
+  <w:style w:customStyle="1" w:styleId="BuiltInTok" w:type="character">
+    <w:name w:val="BuiltInTok"/>
+    <w:basedOn w:val="VerbatimChar"/>
+    <w:rPr>
+      <w:color w:val="008000"/>
+    </w:rPr>
+  </w:style>
+  <w:style w:customStyle="1" w:styleId="ExtensionTok" w:type="character">
+    <w:name w:val="ExtensionTok"/>
+    <w:basedOn w:val="VerbatimChar"/>
+    <w:rPr/>
+  </w:style>
+  <w:style w:customStyle="1" w:styleId="PreprocessorTok" w:type="character">
+    <w:name w:val="PreprocessorTok"/>
+    <w:basedOn w:val="VerbatimChar"/>
+    <w:rPr>
+      <w:color w:val="bc7a00"/>
+    </w:rPr>
+  </w:style>
+  <w:style w:customStyle="1" w:styleId="AttributeTok" w:type="character">
+    <w:name w:val="AttributeTok"/>
+    <w:basedOn w:val="VerbatimChar"/>
+    <w:rPr>
+      <w:color w:val="7d9029"/>
+    </w:rPr>
+  </w:style>
+  <w:style w:customStyle="1" w:styleId="RegionMarkerTok" w:type="character">
+    <w:name w:val="RegionMarkerTok"/>
+    <w:basedOn w:val="VerbatimChar"/>
+    <w:rPr/>
+  </w:style>
+  <w:style w:customStyle="1" w:styleId="InformationTok" w:type="character">
+    <w:name w:val="InformationTok"/>
+    <w:basedOn w:val="VerbatimChar"/>
+    <w:rPr>
+      <w:color w:val="60a0b0"/>
+      <w:b/>
+      <w:i/>
+    </w:rPr>
+  </w:style>
+  <w:style w:customStyle="1" w:styleId="WarningTok" w:type="character">
+    <w:name w:val="WarningTok"/>
+    <w:basedOn w:val="VerbatimChar"/>
+    <w:rPr>
+      <w:color w:val="60a0b0"/>
+      <w:b/>
+      <w:i/>
+    </w:rPr>
+  </w:style>
+  <w:style w:customStyle="1" w:styleId="AlertTok" w:type="character">
+    <w:name w:val="AlertTok"/>
+    <w:basedOn w:val="VerbatimChar"/>
+    <w:rPr>
+      <w:color w:val="ff0000"/>
+      <w:b/>
+    </w:rPr>
+  </w:style>
+  <w:style w:customStyle="1" w:styleId="ErrorTok" w:type="character">
+    <w:name w:val="ErrorTok"/>
+    <w:basedOn w:val="VerbatimChar"/>
+    <w:rPr>
+      <w:color w:val="ff0000"/>
+      <w:b/>
+    </w:rPr>
+  </w:style>
+  <w:style w:customStyle="1" w:styleId="NormalTok" w:type="character">
+    <w:name w:val="NormalTok"/>
+    <w:basedOn w:val="VerbatimChar"/>
+    <w:rPr/>
+  </w:style>
+  <w:style w:customStyle="1" w:styleId="KeywordTok" w:type="character">
+    <w:name w:val="KeywordTok"/>
+    <w:basedOn w:val="VerbatimChar"/>
+    <w:rPr>
+      <w:color w:val="007020"/>
+      <w:b/>
+    </w:rPr>
+  </w:style>
+  <w:style w:customStyle="1" w:styleId="DataTypeTok" w:type="character">
+    <w:name w:val="DataTypeTok"/>
+    <w:basedOn w:val="VerbatimChar"/>
+    <w:rPr>
+      <w:color w:val="902000"/>
+    </w:rPr>
+  </w:style>
+  <w:style w:customStyle="1" w:styleId="DecValTok" w:type="character">
+    <w:name w:val="DecValTok"/>
+    <w:basedOn w:val="VerbatimChar"/>
+    <w:rPr>
+      <w:color w:val="40a070"/>
+    </w:rPr>
+  </w:style>
+  <w:style w:customStyle="1" w:styleId="BaseNTok" w:type="character">
+    <w:name w:val="BaseNTok"/>
+    <w:basedOn w:val="VerbatimChar"/>
+    <w:rPr>
+      <w:color w:val="40a070"/>
+    </w:rPr>
+  </w:style>
+  <w:style w:customStyle="1" w:styleId="FloatTok" w:type="character">
+    <w:name w:val="FloatTok"/>
+    <w:basedOn w:val="VerbatimChar"/>
+    <w:rPr>
+      <w:color w:val="40a070"/>
+    </w:rPr>
+  </w:style>
+  <w:style w:customStyle="1" w:styleId="ConstantTok" w:type="character">
+    <w:name w:val="ConstantTok"/>
+    <w:basedOn w:val="VerbatimChar"/>
+    <w:rPr>
+      <w:color w:val="880000"/>
+    </w:rPr>
+  </w:style>
+  <w:style w:customStyle="1" w:styleId="CharTok" w:type="character">
+    <w:name w:val="CharTok"/>
+    <w:basedOn w:val="VerbatimChar"/>
+    <w:rPr>
+      <w:color w:val="4070a0"/>
+    </w:rPr>
+  </w:style>
+  <w:style w:customStyle="1" w:styleId="SpecialCharTok" w:type="character">
+    <w:name w:val="SpecialCharTok"/>
+    <w:basedOn w:val="VerbatimChar"/>
+    <w:rPr>
+      <w:color w:val="4070a0"/>
+    </w:rPr>
+  </w:style>
+  <w:style w:customStyle="1" w:styleId="StringTok" w:type="character">
+    <w:name w:val="StringTok"/>
+    <w:basedOn w:val="VerbatimChar"/>
+    <w:rPr>
+      <w:color w:val="4070a0"/>
+    </w:rPr>
+  </w:style>
+  <w:style w:customStyle="1" w:styleId="VerbatimStringTok" w:type="character">
+    <w:name w:val="VerbatimStringTok"/>
+    <w:basedOn w:val="VerbatimChar"/>
+    <w:rPr>
+      <w:color w:val="4070a0"/>
+    </w:rPr>
+  </w:style>
+  <w:style w:customStyle="1" w:styleId="SpecialStringTok" w:type="character">
+    <w:name w:val="SpecialStringTok"/>
+    <w:basedOn w:val="VerbatimChar"/>
+    <w:rPr>
+      <w:color w:val="bb6688"/>
+    </w:rPr>
+  </w:style>
+  <w:style w:customStyle="1" w:styleId="ImportTok" w:type="character">
+    <w:name w:val="ImportTok"/>
+    <w:basedOn w:val="VerbatimChar"/>
+    <w:rPr>
+      <w:color w:val="008000"/>
+      <w:b/>
+    </w:rPr>
+  </w:style>
+  <w:style w:customStyle="1" w:styleId="CommentTok" w:type="character">
+    <w:name w:val="CommentTok"/>
+    <w:basedOn w:val="VerbatimChar"/>
+    <w:rPr>
+      <w:color w:val="60a0b0"/>
+      <w:i/>
+    </w:rPr>
+  </w:style>
+  <w:style w:customStyle="1" w:styleId="DocumentationTok" w:type="character">
+    <w:name w:val="DocumentationTok"/>
+    <w:basedOn w:val="VerbatimChar"/>
+    <w:rPr>
+      <w:color w:val="ba2121"/>
+      <w:i/>
+    </w:rPr>
+  </w:style>
+  <w:style w:customStyle="1" w:styleId="AnnotationTok" w:type="character">
+    <w:name w:val="AnnotationTok"/>
+    <w:basedOn w:val="VerbatimChar"/>
+    <w:rPr>
+      <w:color w:val="60a0b0"/>
+      <w:b/>
+      <w:i/>
+    </w:rPr>
+  </w:style>
+  <w:style w:customStyle="1" w:styleId="CommentVarTok" w:type="character">
+    <w:name w:val="CommentVarTok"/>
+    <w:basedOn w:val="VerbatimChar"/>
+    <w:rPr>
+      <w:color w:val="60a0b0"/>
+      <w:b/>
+      <w:i/>
+    </w:rPr>
+  </w:style>
+  <w:style w:customStyle="1" w:styleId="OtherTok" w:type="character">
+    <w:name w:val="OtherTok"/>
+    <w:basedOn w:val="VerbatimChar"/>
+    <w:rPr>
+      <w:color w:val="007020"/>
+    </w:rPr>
+  </w:style>
+  <w:style w:customStyle="1" w:styleId="FunctionTok" w:type="character">
+    <w:name w:val="FunctionTok"/>
+    <w:basedOn w:val="VerbatimChar"/>
+    <w:rPr>
+      <w:color w:val="06287e"/>
+    </w:rPr>
+  </w:style>
+  <w:style w:customStyle="1" w:styleId="VariableTok" w:type="character">
+    <w:name w:val="VariableTok"/>
+    <w:basedOn w:val="VerbatimChar"/>
+    <w:rPr>
+      <w:color w:val="19177c"/>
+    </w:rPr>
+  </w:style>
+  <w:style w:customStyle="1" w:styleId="ControlFlowTok" w:type="character">
+    <w:name w:val="ControlFlowTok"/>
+    <w:basedOn w:val="VerbatimChar"/>
+    <w:rPr>
+      <w:color w:val="007020"/>
+      <w:b/>
+    </w:rPr>
+  </w:style>
+  <w:style w:customStyle="1" w:styleId="OperatorTok" w:type="character">
+    <w:name w:val="OperatorTok"/>
+    <w:basedOn w:val="VerbatimChar"/>
+    <w:rPr>
+      <w:color w:val="666666"/>
+    </w:rPr>
+  </w:style>
+  <w:style w:customStyle="1" w:styleId="BuiltInTok" w:type="character">
+    <w:name w:val="BuiltInTok"/>
+    <w:basedOn w:val="VerbatimChar"/>
+    <w:rPr>
+      <w:color w:val="008000"/>
+    </w:rPr>
+  </w:style>
+  <w:style w:customStyle="1" w:styleId="ExtensionTok" w:type="character">
+    <w:name w:val="ExtensionTok"/>
+    <w:basedOn w:val="VerbatimChar"/>
+    <w:rPr/>
+  </w:style>
+  <w:style w:customStyle="1" w:styleId="PreprocessorTok" w:type="character">
+    <w:name w:val="PreprocessorTok"/>
+    <w:basedOn w:val="VerbatimChar"/>
+    <w:rPr>
+      <w:color w:val="bc7a00"/>
+    </w:rPr>
+  </w:style>
+  <w:style w:customStyle="1" w:styleId="AttributeTok" w:type="character">
+    <w:name w:val="AttributeTok"/>
+    <w:basedOn w:val="VerbatimChar"/>
+    <w:rPr>
+      <w:color w:val="7d9029"/>
+    </w:rPr>
+  </w:style>
+  <w:style w:customStyle="1" w:styleId="RegionMarkerTok" w:type="character">
+    <w:name w:val="RegionMarkerTok"/>
+    <w:basedOn w:val="VerbatimChar"/>
+    <w:rPr/>
+  </w:style>
+  <w:style w:customStyle="1" w:styleId="InformationTok" w:type="character">
+    <w:name w:val="InformationTok"/>
+    <w:basedOn w:val="VerbatimChar"/>
+    <w:rPr>
+      <w:color w:val="60a0b0"/>
+      <w:b/>
+      <w:i/>
+    </w:rPr>
+  </w:style>
+  <w:style w:customStyle="1" w:styleId="WarningTok" w:type="character">
+    <w:name w:val="WarningTok"/>
+    <w:basedOn w:val="VerbatimChar"/>
+    <w:rPr>
+      <w:color w:val="60a0b0"/>
+      <w:b/>
+      <w:i/>
+    </w:rPr>
+  </w:style>
+  <w:style w:customStyle="1" w:styleId="AlertTok" w:type="character">
+    <w:name w:val="AlertTok"/>
+    <w:basedOn w:val="VerbatimChar"/>
+    <w:rPr>
+      <w:color w:val="ff0000"/>
+      <w:b/>
+    </w:rPr>
+  </w:style>
+  <w:style w:customStyle="1" w:styleId="ErrorTok" w:type="character">
+    <w:name w:val="ErrorTok"/>
+    <w:basedOn w:val="VerbatimChar"/>
+    <w:rPr>
+      <w:color w:val="ff0000"/>
+      <w:b/>
+    </w:rPr>
+  </w:style>
+  <w:style w:customStyle="1" w:styleId="NormalTok" w:type="character">
+    <w:name w:val="NormalTok"/>
+    <w:basedOn w:val="VerbatimChar"/>
+    <w:rPr/>
   </w:style>
   <w:style w:type="character" w:customStyle="1" w:styleId="KeywordTok">
     <w:name w:val="KeywordTok"/>

</xml_diff>

<commit_message>
fix: corrigir arquitetura do ciclo de faturas
</commit_message>
<xml_diff>
--- a/DOCUMENTAÇÃO DO SISTEMA CONTROLE FINANCEIRO.docx
+++ b/DOCUMENTAÇÃO DO SISTEMA CONTROLE FINANCEIRO.docx
@@ -35,7 +35,7 @@
         <w:t xml:space="preserve"> </w:t>
       </w:r>
       <w:r>
-        <w:t xml:space="preserve">2.1.0-test.9</w:t>
+        <w:t xml:space="preserve">2.1.0-test.10</w:t>
       </w:r>
       <w:r>
         <w:t xml:space="preserve"> </w:t>
@@ -92,7 +92,7 @@
           <w:rPr>
             <w:rStyle w:val="Hyperlink"/>
           </w:rPr>
-          <w:t xml:space="preserve">https://github.com/boente66/Finance_Assist/releases/tag/v2.1.0-test.9</w:t>
+          <w:t xml:space="preserve">https://github.com/boente66/Finance_Assist/releases/tag/v2.1.0-test.10</w:t>
         </w:r>
       </w:hyperlink>
     </w:p>
@@ -618,19 +618,19 @@
         <w:t xml:space="preserve"> </w:t>
       </w:r>
       <w:r>
-        <w:t xml:space="preserve">o sistema abre a competência seguinte. O pagamento cria uma linha negativa na</w:t>
+        <w:t xml:space="preserve">o sistema abre a competência seguinte. O pagamento fica no histórico oficial da</w:t>
       </w:r>
       <w:r>
         <w:t xml:space="preserve"> </w:t>
       </w:r>
       <w:r>
-        <w:t xml:space="preserve">fatura e uma saída negativa na conta escolhida; ele não modifica nem apaga as</w:t>
+        <w:t xml:space="preserve">fatura e cria uma saída negativa na conta escolhida. Ele não é duplicado como</w:t>
       </w:r>
       <w:r>
         <w:t xml:space="preserve"> </w:t>
       </w:r>
       <w:r>
-        <w:t xml:space="preserve">compras positivas do histórico.</w:t>
+        <w:t xml:space="preserve">movimento e não modifica nem apaga as compras positivas do histórico.</w:t>
       </w:r>
     </w:p>
     <w:p>
@@ -666,7 +666,13 @@
         <w:t xml:space="preserve"> </w:t>
       </w:r>
       <w:r>
-        <w:t xml:space="preserve">recompõe o limite. No estorno, a compra original permanece registrada.</w:t>
+        <w:t xml:space="preserve">recompõe o limite. No estorno, a compra original permanece registrada. O ajuste</w:t>
+      </w:r>
+      <w:r>
+        <w:t xml:space="preserve"> </w:t>
+      </w:r>
+      <w:r>
+        <w:t xml:space="preserve">pode reduzir ou aumentar o total, conforme a natureza escolhida.</w:t>
       </w:r>
     </w:p>
     <w:bookmarkStart w:id="30" w:name="importação-de-faturas"/>
@@ -1131,7 +1137,7 @@
         <w:pStyle w:val="Compact"/>
       </w:pPr>
       <w:r>
-        <w:t xml:space="preserve">Baixe finance-assist_2.1.0-test.9_windows-x64.zip.</w:t>
+        <w:t xml:space="preserve">Baixe finance-assist_2.1.0-test.10_windows-x64.zip.</w:t>
       </w:r>
     </w:p>
     <w:p>
@@ -1184,7 +1190,7 @@
         <w:rPr>
           <w:rStyle w:val="VerbatimChar"/>
         </w:rPr>
-        <w:t xml:space="preserve">sudo apt install ./finance-assist_2.1.0-test.9_amd64.deb</w:t>
+        <w:t xml:space="preserve">sudo apt install ./finance-assist_2.1.0-test.10_amd64.deb</w:t>
       </w:r>
     </w:p>
     <w:p>
@@ -1487,7 +1493,7 @@
         <w:pStyle w:val="Compact"/>
       </w:pPr>
       <w:r>
-        <w:t xml:space="preserve">Versão test.9:</w:t>
+        <w:t xml:space="preserve">Versão test.10:</w:t>
       </w:r>
       <w:r>
         <w:t xml:space="preserve"> </w:t>
@@ -1497,7 +1503,7 @@
           <w:rPr>
             <w:rStyle w:val="Hyperlink"/>
           </w:rPr>
-          <w:t xml:space="preserve">https://github.com/boente66/Finance_Assist/releases/tag/v2.1.0-test.9</w:t>
+          <w:t xml:space="preserve">https://github.com/boente66/Finance_Assist/releases/tag/v2.1.0-test.10</w:t>
         </w:r>
       </w:hyperlink>
     </w:p>
@@ -1529,7 +1535,7 @@
         <w:pStyle w:val="FirstParagraph"/>
       </w:pPr>
       <w:r>
-        <w:t xml:space="preserve">A versão 2.1.0-test.9 foi validada com 251 testes automatizados. Os instaladores</w:t>
+        <w:t xml:space="preserve">A versão 2.1.0-test.10 foi validada com 263 testes automatizados. Os instaladores</w:t>
       </w:r>
       <w:r>
         <w:t xml:space="preserve"> </w:t>
@@ -9583,6 +9589,458 @@
     <w:basedOn w:val="VerbatimChar"/>
     <w:rPr/>
   </w:style>
+  <w:style w:customStyle="1" w:styleId="KeywordTok" w:type="character">
+    <w:name w:val="KeywordTok"/>
+    <w:basedOn w:val="VerbatimChar"/>
+    <w:rPr>
+      <w:color w:val="007020"/>
+      <w:b/>
+    </w:rPr>
+  </w:style>
+  <w:style w:customStyle="1" w:styleId="DataTypeTok" w:type="character">
+    <w:name w:val="DataTypeTok"/>
+    <w:basedOn w:val="VerbatimChar"/>
+    <w:rPr>
+      <w:color w:val="902000"/>
+    </w:rPr>
+  </w:style>
+  <w:style w:customStyle="1" w:styleId="DecValTok" w:type="character">
+    <w:name w:val="DecValTok"/>
+    <w:basedOn w:val="VerbatimChar"/>
+    <w:rPr>
+      <w:color w:val="40a070"/>
+    </w:rPr>
+  </w:style>
+  <w:style w:customStyle="1" w:styleId="BaseNTok" w:type="character">
+    <w:name w:val="BaseNTok"/>
+    <w:basedOn w:val="VerbatimChar"/>
+    <w:rPr>
+      <w:color w:val="40a070"/>
+    </w:rPr>
+  </w:style>
+  <w:style w:customStyle="1" w:styleId="FloatTok" w:type="character">
+    <w:name w:val="FloatTok"/>
+    <w:basedOn w:val="VerbatimChar"/>
+    <w:rPr>
+      <w:color w:val="40a070"/>
+    </w:rPr>
+  </w:style>
+  <w:style w:customStyle="1" w:styleId="ConstantTok" w:type="character">
+    <w:name w:val="ConstantTok"/>
+    <w:basedOn w:val="VerbatimChar"/>
+    <w:rPr>
+      <w:color w:val="880000"/>
+    </w:rPr>
+  </w:style>
+  <w:style w:customStyle="1" w:styleId="CharTok" w:type="character">
+    <w:name w:val="CharTok"/>
+    <w:basedOn w:val="VerbatimChar"/>
+    <w:rPr>
+      <w:color w:val="4070a0"/>
+    </w:rPr>
+  </w:style>
+  <w:style w:customStyle="1" w:styleId="SpecialCharTok" w:type="character">
+    <w:name w:val="SpecialCharTok"/>
+    <w:basedOn w:val="VerbatimChar"/>
+    <w:rPr>
+      <w:color w:val="4070a0"/>
+    </w:rPr>
+  </w:style>
+  <w:style w:customStyle="1" w:styleId="StringTok" w:type="character">
+    <w:name w:val="StringTok"/>
+    <w:basedOn w:val="VerbatimChar"/>
+    <w:rPr>
+      <w:color w:val="4070a0"/>
+    </w:rPr>
+  </w:style>
+  <w:style w:customStyle="1" w:styleId="VerbatimStringTok" w:type="character">
+    <w:name w:val="VerbatimStringTok"/>
+    <w:basedOn w:val="VerbatimChar"/>
+    <w:rPr>
+      <w:color w:val="4070a0"/>
+    </w:rPr>
+  </w:style>
+  <w:style w:customStyle="1" w:styleId="SpecialStringTok" w:type="character">
+    <w:name w:val="SpecialStringTok"/>
+    <w:basedOn w:val="VerbatimChar"/>
+    <w:rPr>
+      <w:color w:val="bb6688"/>
+    </w:rPr>
+  </w:style>
+  <w:style w:customStyle="1" w:styleId="ImportTok" w:type="character">
+    <w:name w:val="ImportTok"/>
+    <w:basedOn w:val="VerbatimChar"/>
+    <w:rPr>
+      <w:color w:val="008000"/>
+      <w:b/>
+    </w:rPr>
+  </w:style>
+  <w:style w:customStyle="1" w:styleId="CommentTok" w:type="character">
+    <w:name w:val="CommentTok"/>
+    <w:basedOn w:val="VerbatimChar"/>
+    <w:rPr>
+      <w:color w:val="60a0b0"/>
+      <w:i/>
+    </w:rPr>
+  </w:style>
+  <w:style w:customStyle="1" w:styleId="DocumentationTok" w:type="character">
+    <w:name w:val="DocumentationTok"/>
+    <w:basedOn w:val="VerbatimChar"/>
+    <w:rPr>
+      <w:color w:val="ba2121"/>
+      <w:i/>
+    </w:rPr>
+  </w:style>
+  <w:style w:customStyle="1" w:styleId="AnnotationTok" w:type="character">
+    <w:name w:val="AnnotationTok"/>
+    <w:basedOn w:val="VerbatimChar"/>
+    <w:rPr>
+      <w:color w:val="60a0b0"/>
+      <w:b/>
+      <w:i/>
+    </w:rPr>
+  </w:style>
+  <w:style w:customStyle="1" w:styleId="CommentVarTok" w:type="character">
+    <w:name w:val="CommentVarTok"/>
+    <w:basedOn w:val="VerbatimChar"/>
+    <w:rPr>
+      <w:color w:val="60a0b0"/>
+      <w:b/>
+      <w:i/>
+    </w:rPr>
+  </w:style>
+  <w:style w:customStyle="1" w:styleId="OtherTok" w:type="character">
+    <w:name w:val="OtherTok"/>
+    <w:basedOn w:val="VerbatimChar"/>
+    <w:rPr>
+      <w:color w:val="007020"/>
+    </w:rPr>
+  </w:style>
+  <w:style w:customStyle="1" w:styleId="FunctionTok" w:type="character">
+    <w:name w:val="FunctionTok"/>
+    <w:basedOn w:val="VerbatimChar"/>
+    <w:rPr>
+      <w:color w:val="06287e"/>
+    </w:rPr>
+  </w:style>
+  <w:style w:customStyle="1" w:styleId="VariableTok" w:type="character">
+    <w:name w:val="VariableTok"/>
+    <w:basedOn w:val="VerbatimChar"/>
+    <w:rPr>
+      <w:color w:val="19177c"/>
+    </w:rPr>
+  </w:style>
+  <w:style w:customStyle="1" w:styleId="ControlFlowTok" w:type="character">
+    <w:name w:val="ControlFlowTok"/>
+    <w:basedOn w:val="VerbatimChar"/>
+    <w:rPr>
+      <w:color w:val="007020"/>
+      <w:b/>
+    </w:rPr>
+  </w:style>
+  <w:style w:customStyle="1" w:styleId="OperatorTok" w:type="character">
+    <w:name w:val="OperatorTok"/>
+    <w:basedOn w:val="VerbatimChar"/>
+    <w:rPr>
+      <w:color w:val="666666"/>
+    </w:rPr>
+  </w:style>
+  <w:style w:customStyle="1" w:styleId="BuiltInTok" w:type="character">
+    <w:name w:val="BuiltInTok"/>
+    <w:basedOn w:val="VerbatimChar"/>
+    <w:rPr>
+      <w:color w:val="008000"/>
+    </w:rPr>
+  </w:style>
+  <w:style w:customStyle="1" w:styleId="ExtensionTok" w:type="character">
+    <w:name w:val="ExtensionTok"/>
+    <w:basedOn w:val="VerbatimChar"/>
+    <w:rPr/>
+  </w:style>
+  <w:style w:customStyle="1" w:styleId="PreprocessorTok" w:type="character">
+    <w:name w:val="PreprocessorTok"/>
+    <w:basedOn w:val="VerbatimChar"/>
+    <w:rPr>
+      <w:color w:val="bc7a00"/>
+    </w:rPr>
+  </w:style>
+  <w:style w:customStyle="1" w:styleId="AttributeTok" w:type="character">
+    <w:name w:val="AttributeTok"/>
+    <w:basedOn w:val="VerbatimChar"/>
+    <w:rPr>
+      <w:color w:val="7d9029"/>
+    </w:rPr>
+  </w:style>
+  <w:style w:customStyle="1" w:styleId="RegionMarkerTok" w:type="character">
+    <w:name w:val="RegionMarkerTok"/>
+    <w:basedOn w:val="VerbatimChar"/>
+    <w:rPr/>
+  </w:style>
+  <w:style w:customStyle="1" w:styleId="InformationTok" w:type="character">
+    <w:name w:val="InformationTok"/>
+    <w:basedOn w:val="VerbatimChar"/>
+    <w:rPr>
+      <w:color w:val="60a0b0"/>
+      <w:b/>
+      <w:i/>
+    </w:rPr>
+  </w:style>
+  <w:style w:customStyle="1" w:styleId="WarningTok" w:type="character">
+    <w:name w:val="WarningTok"/>
+    <w:basedOn w:val="VerbatimChar"/>
+    <w:rPr>
+      <w:color w:val="60a0b0"/>
+      <w:b/>
+      <w:i/>
+    </w:rPr>
+  </w:style>
+  <w:style w:customStyle="1" w:styleId="AlertTok" w:type="character">
+    <w:name w:val="AlertTok"/>
+    <w:basedOn w:val="VerbatimChar"/>
+    <w:rPr>
+      <w:color w:val="ff0000"/>
+      <w:b/>
+    </w:rPr>
+  </w:style>
+  <w:style w:customStyle="1" w:styleId="ErrorTok" w:type="character">
+    <w:name w:val="ErrorTok"/>
+    <w:basedOn w:val="VerbatimChar"/>
+    <w:rPr>
+      <w:color w:val="ff0000"/>
+      <w:b/>
+    </w:rPr>
+  </w:style>
+  <w:style w:customStyle="1" w:styleId="NormalTok" w:type="character">
+    <w:name w:val="NormalTok"/>
+    <w:basedOn w:val="VerbatimChar"/>
+    <w:rPr/>
+  </w:style>
+  <w:style w:customStyle="1" w:styleId="KeywordTok" w:type="character">
+    <w:name w:val="KeywordTok"/>
+    <w:basedOn w:val="VerbatimChar"/>
+    <w:rPr>
+      <w:color w:val="007020"/>
+      <w:b/>
+    </w:rPr>
+  </w:style>
+  <w:style w:customStyle="1" w:styleId="DataTypeTok" w:type="character">
+    <w:name w:val="DataTypeTok"/>
+    <w:basedOn w:val="VerbatimChar"/>
+    <w:rPr>
+      <w:color w:val="902000"/>
+    </w:rPr>
+  </w:style>
+  <w:style w:customStyle="1" w:styleId="DecValTok" w:type="character">
+    <w:name w:val="DecValTok"/>
+    <w:basedOn w:val="VerbatimChar"/>
+    <w:rPr>
+      <w:color w:val="40a070"/>
+    </w:rPr>
+  </w:style>
+  <w:style w:customStyle="1" w:styleId="BaseNTok" w:type="character">
+    <w:name w:val="BaseNTok"/>
+    <w:basedOn w:val="VerbatimChar"/>
+    <w:rPr>
+      <w:color w:val="40a070"/>
+    </w:rPr>
+  </w:style>
+  <w:style w:customStyle="1" w:styleId="FloatTok" w:type="character">
+    <w:name w:val="FloatTok"/>
+    <w:basedOn w:val="VerbatimChar"/>
+    <w:rPr>
+      <w:color w:val="40a070"/>
+    </w:rPr>
+  </w:style>
+  <w:style w:customStyle="1" w:styleId="ConstantTok" w:type="character">
+    <w:name w:val="ConstantTok"/>
+    <w:basedOn w:val="VerbatimChar"/>
+    <w:rPr>
+      <w:color w:val="880000"/>
+    </w:rPr>
+  </w:style>
+  <w:style w:customStyle="1" w:styleId="CharTok" w:type="character">
+    <w:name w:val="CharTok"/>
+    <w:basedOn w:val="VerbatimChar"/>
+    <w:rPr>
+      <w:color w:val="4070a0"/>
+    </w:rPr>
+  </w:style>
+  <w:style w:customStyle="1" w:styleId="SpecialCharTok" w:type="character">
+    <w:name w:val="SpecialCharTok"/>
+    <w:basedOn w:val="VerbatimChar"/>
+    <w:rPr>
+      <w:color w:val="4070a0"/>
+    </w:rPr>
+  </w:style>
+  <w:style w:customStyle="1" w:styleId="StringTok" w:type="character">
+    <w:name w:val="StringTok"/>
+    <w:basedOn w:val="VerbatimChar"/>
+    <w:rPr>
+      <w:color w:val="4070a0"/>
+    </w:rPr>
+  </w:style>
+  <w:style w:customStyle="1" w:styleId="VerbatimStringTok" w:type="character">
+    <w:name w:val="VerbatimStringTok"/>
+    <w:basedOn w:val="VerbatimChar"/>
+    <w:rPr>
+      <w:color w:val="4070a0"/>
+    </w:rPr>
+  </w:style>
+  <w:style w:customStyle="1" w:styleId="SpecialStringTok" w:type="character">
+    <w:name w:val="SpecialStringTok"/>
+    <w:basedOn w:val="VerbatimChar"/>
+    <w:rPr>
+      <w:color w:val="bb6688"/>
+    </w:rPr>
+  </w:style>
+  <w:style w:customStyle="1" w:styleId="ImportTok" w:type="character">
+    <w:name w:val="ImportTok"/>
+    <w:basedOn w:val="VerbatimChar"/>
+    <w:rPr>
+      <w:color w:val="008000"/>
+      <w:b/>
+    </w:rPr>
+  </w:style>
+  <w:style w:customStyle="1" w:styleId="CommentTok" w:type="character">
+    <w:name w:val="CommentTok"/>
+    <w:basedOn w:val="VerbatimChar"/>
+    <w:rPr>
+      <w:color w:val="60a0b0"/>
+      <w:i/>
+    </w:rPr>
+  </w:style>
+  <w:style w:customStyle="1" w:styleId="DocumentationTok" w:type="character">
+    <w:name w:val="DocumentationTok"/>
+    <w:basedOn w:val="VerbatimChar"/>
+    <w:rPr>
+      <w:color w:val="ba2121"/>
+      <w:i/>
+    </w:rPr>
+  </w:style>
+  <w:style w:customStyle="1" w:styleId="AnnotationTok" w:type="character">
+    <w:name w:val="AnnotationTok"/>
+    <w:basedOn w:val="VerbatimChar"/>
+    <w:rPr>
+      <w:color w:val="60a0b0"/>
+      <w:b/>
+      <w:i/>
+    </w:rPr>
+  </w:style>
+  <w:style w:customStyle="1" w:styleId="CommentVarTok" w:type="character">
+    <w:name w:val="CommentVarTok"/>
+    <w:basedOn w:val="VerbatimChar"/>
+    <w:rPr>
+      <w:color w:val="60a0b0"/>
+      <w:b/>
+      <w:i/>
+    </w:rPr>
+  </w:style>
+  <w:style w:customStyle="1" w:styleId="OtherTok" w:type="character">
+    <w:name w:val="OtherTok"/>
+    <w:basedOn w:val="VerbatimChar"/>
+    <w:rPr>
+      <w:color w:val="007020"/>
+    </w:rPr>
+  </w:style>
+  <w:style w:customStyle="1" w:styleId="FunctionTok" w:type="character">
+    <w:name w:val="FunctionTok"/>
+    <w:basedOn w:val="VerbatimChar"/>
+    <w:rPr>
+      <w:color w:val="06287e"/>
+    </w:rPr>
+  </w:style>
+  <w:style w:customStyle="1" w:styleId="VariableTok" w:type="character">
+    <w:name w:val="VariableTok"/>
+    <w:basedOn w:val="VerbatimChar"/>
+    <w:rPr>
+      <w:color w:val="19177c"/>
+    </w:rPr>
+  </w:style>
+  <w:style w:customStyle="1" w:styleId="ControlFlowTok" w:type="character">
+    <w:name w:val="ControlFlowTok"/>
+    <w:basedOn w:val="VerbatimChar"/>
+    <w:rPr>
+      <w:color w:val="007020"/>
+      <w:b/>
+    </w:rPr>
+  </w:style>
+  <w:style w:customStyle="1" w:styleId="OperatorTok" w:type="character">
+    <w:name w:val="OperatorTok"/>
+    <w:basedOn w:val="VerbatimChar"/>
+    <w:rPr>
+      <w:color w:val="666666"/>
+    </w:rPr>
+  </w:style>
+  <w:style w:customStyle="1" w:styleId="BuiltInTok" w:type="character">
+    <w:name w:val="BuiltInTok"/>
+    <w:basedOn w:val="VerbatimChar"/>
+    <w:rPr>
+      <w:color w:val="008000"/>
+    </w:rPr>
+  </w:style>
+  <w:style w:customStyle="1" w:styleId="ExtensionTok" w:type="character">
+    <w:name w:val="ExtensionTok"/>
+    <w:basedOn w:val="VerbatimChar"/>
+    <w:rPr/>
+  </w:style>
+  <w:style w:customStyle="1" w:styleId="PreprocessorTok" w:type="character">
+    <w:name w:val="PreprocessorTok"/>
+    <w:basedOn w:val="VerbatimChar"/>
+    <w:rPr>
+      <w:color w:val="bc7a00"/>
+    </w:rPr>
+  </w:style>
+  <w:style w:customStyle="1" w:styleId="AttributeTok" w:type="character">
+    <w:name w:val="AttributeTok"/>
+    <w:basedOn w:val="VerbatimChar"/>
+    <w:rPr>
+      <w:color w:val="7d9029"/>
+    </w:rPr>
+  </w:style>
+  <w:style w:customStyle="1" w:styleId="RegionMarkerTok" w:type="character">
+    <w:name w:val="RegionMarkerTok"/>
+    <w:basedOn w:val="VerbatimChar"/>
+    <w:rPr/>
+  </w:style>
+  <w:style w:customStyle="1" w:styleId="InformationTok" w:type="character">
+    <w:name w:val="InformationTok"/>
+    <w:basedOn w:val="VerbatimChar"/>
+    <w:rPr>
+      <w:color w:val="60a0b0"/>
+      <w:b/>
+      <w:i/>
+    </w:rPr>
+  </w:style>
+  <w:style w:customStyle="1" w:styleId="WarningTok" w:type="character">
+    <w:name w:val="WarningTok"/>
+    <w:basedOn w:val="VerbatimChar"/>
+    <w:rPr>
+      <w:color w:val="60a0b0"/>
+      <w:b/>
+      <w:i/>
+    </w:rPr>
+  </w:style>
+  <w:style w:customStyle="1" w:styleId="AlertTok" w:type="character">
+    <w:name w:val="AlertTok"/>
+    <w:basedOn w:val="VerbatimChar"/>
+    <w:rPr>
+      <w:color w:val="ff0000"/>
+      <w:b/>
+    </w:rPr>
+  </w:style>
+  <w:style w:customStyle="1" w:styleId="ErrorTok" w:type="character">
+    <w:name w:val="ErrorTok"/>
+    <w:basedOn w:val="VerbatimChar"/>
+    <w:rPr>
+      <w:color w:val="ff0000"/>
+      <w:b/>
+    </w:rPr>
+  </w:style>
+  <w:style w:customStyle="1" w:styleId="NormalTok" w:type="character">
+    <w:name w:val="NormalTok"/>
+    <w:basedOn w:val="VerbatimChar"/>
+    <w:rPr/>
+  </w:style>
   <w:style w:type="character" w:customStyle="1" w:styleId="KeywordTok">
     <w:name w:val="KeywordTok"/>
     <w:basedOn w:val="VerbatimChar"/>

</xml_diff>

<commit_message>
fix: exibir faturas e planejamento mensal
</commit_message>
<xml_diff>
--- a/DOCUMENTAÇÃO DO SISTEMA CONTROLE FINANCEIRO.docx
+++ b/DOCUMENTAÇÃO DO SISTEMA CONTROLE FINANCEIRO.docx
@@ -1,6 +1,6 @@
 
 <file path=word/document.xml><?xml version="1.0" encoding="utf-8"?>
-<w:document xmlns:w="http://schemas.openxmlformats.org/wordprocessingml/2006/main" xmlns:m="http://schemas.openxmlformats.org/officeDocument/2006/math" xmlns:r="http://schemas.openxmlformats.org/officeDocument/2006/relationships" xmlns:o="urn:schemas-microsoft-com:office:office" xmlns:v="urn:schemas-microsoft-com:vml" xmlns:w10="urn:schemas-microsoft-com:office:word" xmlns:a="http://schemas.openxmlformats.org/drawingml/2006/main" xmlns:pic="http://schemas.openxmlformats.org/drawingml/2006/picture" xmlns:wp="http://schemas.openxmlformats.org/drawingml/2006/wordprocessingDrawing">
+<w:document xmlns:ns1="http://schemas.openxmlformats.org/officeDocument/2006/relationships" xmlns:w="http://schemas.openxmlformats.org/wordprocessingml/2006/main">
   <w:body>
     <w:bookmarkStart w:id="45" w:name="manual-do-usuário"/>
     <w:p>
@@ -35,7 +35,7 @@
         <w:t xml:space="preserve"> </w:t>
       </w:r>
       <w:r>
-        <w:t xml:space="preserve">2.1.0-test.10</w:t>
+        <w:t xml:space="preserve">2.1.0-test.11</w:t>
       </w:r>
       <w:r>
         <w:t xml:space="preserve"> </w:t>
@@ -66,7 +66,7 @@
       <w:r>
         <w:t xml:space="preserve"> </w:t>
       </w:r>
-      <w:hyperlink r:id="rId20">
+      <w:hyperlink ns1:id="rId20">
         <w:r>
           <w:rPr>
             <w:rStyle w:val="Hyperlink"/>
@@ -87,12 +87,12 @@
       <w:r>
         <w:t xml:space="preserve"> </w:t>
       </w:r>
-      <w:hyperlink r:id="rId21">
+      <w:hyperlink ns1:id="rId21">
         <w:r>
           <w:rPr>
             <w:rStyle w:val="Hyperlink"/>
           </w:rPr>
-          <w:t xml:space="preserve">https://github.com/boente66/Finance_Assist/releases/tag/v2.1.0-test.10</w:t>
+          <w:t xml:space="preserve">https://github.com/boente66/Finance_Assist/releases/tag/v2.1.0-test.11</w:t>
         </w:r>
       </w:hyperlink>
     </w:p>
@@ -1137,7 +1137,7 @@
         <w:pStyle w:val="Compact"/>
       </w:pPr>
       <w:r>
-        <w:t xml:space="preserve">Baixe finance-assist_2.1.0-test.10_windows-x64.zip.</w:t>
+        <w:t xml:space="preserve">Baixe finance-assist_2.1.0-test.11_windows-x64.zip.</w:t>
       </w:r>
     </w:p>
     <w:p>
@@ -1190,7 +1190,7 @@
         <w:rPr>
           <w:rStyle w:val="VerbatimChar"/>
         </w:rPr>
-        <w:t xml:space="preserve">sudo apt install ./finance-assist_2.1.0-test.10_amd64.deb</w:t>
+        <w:t xml:space="preserve">sudo apt install ./finance-assist_2.1.0-test.11_amd64.deb</w:t>
       </w:r>
     </w:p>
     <w:p>
@@ -1475,7 +1475,7 @@
       <w:r>
         <w:t xml:space="preserve"> </w:t>
       </w:r>
-      <w:hyperlink r:id="rId20">
+      <w:hyperlink ns1:id="rId20">
         <w:r>
           <w:rPr>
             <w:rStyle w:val="Hyperlink"/>
@@ -1493,17 +1493,17 @@
         <w:pStyle w:val="Compact"/>
       </w:pPr>
       <w:r>
-        <w:t xml:space="preserve">Versão test.10:</w:t>
+        <w:t xml:space="preserve">Versão test.11:</w:t>
       </w:r>
       <w:r>
         <w:t xml:space="preserve"> </w:t>
       </w:r>
-      <w:hyperlink r:id="rId21">
+      <w:hyperlink ns1:id="rId21">
         <w:r>
           <w:rPr>
             <w:rStyle w:val="Hyperlink"/>
           </w:rPr>
-          <w:t xml:space="preserve">https://github.com/boente66/Finance_Assist/releases/tag/v2.1.0-test.10</w:t>
+          <w:t xml:space="preserve">https://github.com/boente66/Finance_Assist/releases/tag/v2.1.0-test.11</w:t>
         </w:r>
       </w:hyperlink>
     </w:p>
@@ -1521,7 +1521,7 @@
       <w:r>
         <w:t xml:space="preserve"> </w:t>
       </w:r>
-      <w:hyperlink r:id="rId43">
+      <w:hyperlink ns1:id="rId43">
         <w:r>
           <w:rPr>
             <w:rStyle w:val="Hyperlink"/>
@@ -1535,7 +1535,7 @@
         <w:pStyle w:val="FirstParagraph"/>
       </w:pPr>
       <w:r>
-        <w:t xml:space="preserve">A versão 2.1.0-test.10 foi validada com 263 testes automatizados. Os instaladores</w:t>
+        <w:t xml:space="preserve">A versão 2.1.0-test.11 foi validada com 263 testes automatizados. Os instaladores</w:t>
       </w:r>
       <w:r>
         <w:t xml:space="preserve"> </w:t>
@@ -1546,6 +1546,58 @@
     </w:p>
     <w:bookmarkEnd w:id="44"/>
     <w:bookmarkEnd w:id="45"/>
+    <w:p>
+      <w:pPr>
+        <w:pStyle w:val="Heading1"/>
+      </w:pPr>
+      <w:r>
+        <w:t>Atualização 2.1.0-test.11 — visualização e orçamento mensal</w:t>
+      </w:r>
+    </w:p>
+    <w:p>
+      <w:r>
+        <w:t>Atualização de 20 de setembro de 2026. O banco de dados existente é preservado durante a instalação e não deve ser apagado.</w:t>
+      </w:r>
+    </w:p>
+    <w:p>
+      <w:pPr>
+        <w:pStyle w:val="Heading2"/>
+      </w:pPr>
+      <w:r>
+        <w:t>Faturas de cartão</w:t>
+      </w:r>
+    </w:p>
+    <w:p>
+      <w:r>
+        <w:t>A tabela de lançamentos agora mantém altura suficiente mesmo quando existem muitas competências futuras. Compras de faturas pagas continuam positivas, visíveis e preservadas no histórico. A paginação também retorna automaticamente a uma página válida ao trocar de cartão, mês ou ano.</w:t>
+      </w:r>
+    </w:p>
+    <w:p>
+      <w:pPr>
+        <w:pStyle w:val="Heading2"/>
+      </w:pPr>
+      <w:r>
+        <w:t>Agendamentos</w:t>
+      </w:r>
+    </w:p>
+    <w:p>
+      <w:r>
+        <w:t>A tela exibe botões para o mês atual e os três meses posteriores. Ao clicar em um mês, a tabela muda imediatamente para os compromissos daquela competência e recalcula receitas, agendamentos a pagar, faturas, total a pagar e resultado previsto.</w:t>
+      </w:r>
+    </w:p>
+    <w:p>
+      <w:pPr>
+        <w:pStyle w:val="Heading2"/>
+      </w:pPr>
+      <w:r>
+        <w:t>Validação</w:t>
+      </w:r>
+    </w:p>
+    <w:p>
+      <w:r>
+        <w:t>Foram aprovados 265 testes automatizados, incluindo cenários específicos para histórico de fatura paga e navegação mensal instantânea. A alteração não recria nem remove bancos existentes.</w:t>
+      </w:r>
+    </w:p>
     <w:sectPr>
       <w:pgSz w:h="16838" w:w="11906"/>
       <w:pgMar w:bottom="1134" w:footer="0" w:gutter="0" w:header="0" w:left="1134" w:right="1134" w:top="1134"/>

</xml_diff>

<commit_message>
fix: corrigir layouts de faturas e agendamentos
</commit_message>
<xml_diff>
--- a/DOCUMENTAÇÃO DO SISTEMA CONTROLE FINANCEIRO.docx
+++ b/DOCUMENTAÇÃO DO SISTEMA CONTROLE FINANCEIRO.docx
@@ -35,7 +35,7 @@
         <w:t xml:space="preserve"> </w:t>
       </w:r>
       <w:r>
-        <w:t xml:space="preserve">2.1.0-test.11</w:t>
+        <w:t xml:space="preserve">2.1.0-test.12</w:t>
       </w:r>
       <w:r>
         <w:t xml:space="preserve"> </w:t>
@@ -92,7 +92,7 @@
           <w:rPr>
             <w:rStyle w:val="Hyperlink"/>
           </w:rPr>
-          <w:t xml:space="preserve">https://github.com/boente66/Finance_Assist/releases/tag/v2.1.0-test.11</w:t>
+          <w:t xml:space="preserve">https://github.com/boente66/Finance_Assist/releases/tag/v2.1.0-test.12</w:t>
         </w:r>
       </w:hyperlink>
     </w:p>
@@ -1137,7 +1137,7 @@
         <w:pStyle w:val="Compact"/>
       </w:pPr>
       <w:r>
-        <w:t xml:space="preserve">Baixe finance-assist_2.1.0-test.11_windows-x64.zip.</w:t>
+        <w:t xml:space="preserve">Baixe finance-assist_2.1.0-test.12_windows-x64.zip.</w:t>
       </w:r>
     </w:p>
     <w:p>
@@ -1190,7 +1190,7 @@
         <w:rPr>
           <w:rStyle w:val="VerbatimChar"/>
         </w:rPr>
-        <w:t xml:space="preserve">sudo apt install ./finance-assist_2.1.0-test.11_amd64.deb</w:t>
+        <w:t xml:space="preserve">sudo apt install ./finance-assist_2.1.0-test.12_amd64.deb</w:t>
       </w:r>
     </w:p>
     <w:p>
@@ -1493,7 +1493,7 @@
         <w:pStyle w:val="Compact"/>
       </w:pPr>
       <w:r>
-        <w:t xml:space="preserve">Versão test.11:</w:t>
+        <w:t xml:space="preserve">Versão test.12:</w:t>
       </w:r>
       <w:r>
         <w:t xml:space="preserve"> </w:t>
@@ -1503,7 +1503,7 @@
           <w:rPr>
             <w:rStyle w:val="Hyperlink"/>
           </w:rPr>
-          <w:t xml:space="preserve">https://github.com/boente66/Finance_Assist/releases/tag/v2.1.0-test.11</w:t>
+          <w:t xml:space="preserve">https://github.com/boente66/Finance_Assist/releases/tag/v2.1.0-test.12</w:t>
         </w:r>
       </w:hyperlink>
     </w:p>
@@ -1535,7 +1535,7 @@
         <w:pStyle w:val="FirstParagraph"/>
       </w:pPr>
       <w:r>
-        <w:t xml:space="preserve">A versão 2.1.0-test.11 foi validada com 263 testes automatizados. Os instaladores</w:t>
+        <w:t xml:space="preserve">A versão 2.1.0-test.12 foi validada com 263 testes automatizados. Os instaladores</w:t>
       </w:r>
       <w:r>
         <w:t xml:space="preserve"> </w:t>
@@ -1551,7 +1551,7 @@
         <w:pStyle w:val="Heading1"/>
       </w:pPr>
       <w:r>
-        <w:t>Atualização 2.1.0-test.11 — visualização e orçamento mensal</w:t>
+        <w:t>Atualização 2.1.0-test.12 — visualização e orçamento mensal</w:t>
       </w:r>
     </w:p>
     <w:p>
@@ -1596,6 +1596,58 @@
     <w:p>
       <w:r>
         <w:t>Foram aprovados 265 testes automatizados, incluindo cenários específicos para histórico de fatura paga e navegação mensal instantânea. A alteração não recria nem remove bancos existentes.</w:t>
+      </w:r>
+    </w:p>
+    <w:p>
+      <w:pPr>
+        <w:pStyle w:val="Heading1"/>
+      </w:pPr>
+      <w:r>
+        <w:t>Atualização 2.1.0-test.12 — correções de interface e competências</w:t>
+      </w:r>
+    </w:p>
+    <w:p>
+      <w:r>
+        <w:t>Atualização de 21 de setembro de 2026. O banco existente é preservado e não deve ser apagado durante a instalação.</w:t>
+      </w:r>
+    </w:p>
+    <w:p>
+      <w:pPr>
+        <w:pStyle w:val="Heading2"/>
+      </w:pPr>
+      <w:r>
+        <w:t>Faturas e contas</w:t>
+      </w:r>
+    </w:p>
+    <w:p>
+      <w:r>
+        <w:t>A paginação não se sobrepõe mais às linhas e fica oculta quando existe apenas uma página. Próximas faturas mostra somente competências posteriores à selecionada e em ordem cronológica. O mesmo ajuste de espaço e paginação foi aplicado ao painel de contas.</w:t>
+      </w:r>
+    </w:p>
+    <w:p>
+      <w:pPr>
+        <w:pStyle w:val="Heading2"/>
+      </w:pPr>
+      <w:r>
+        <w:t>Agendamentos</w:t>
+      </w:r>
+    </w:p>
+    <w:p>
+      <w:r>
+        <w:t>O mês selecionado possui destaque visual. A tabela mantém altura útil, o resumo ocupa uma linha em larguras comuns e colunas auxiliares são ocultadas responsivamente para preservar data, descrição, valor e status.</w:t>
+      </w:r>
+    </w:p>
+    <w:p>
+      <w:pPr>
+        <w:pStyle w:val="Heading2"/>
+      </w:pPr>
+      <w:r>
+        <w:t>Validação</w:t>
+      </w:r>
+    </w:p>
+    <w:p>
+      <w:r>
+        <w:t>Foram validados 267 cenários automatizados e renderizações equivalentes a 1366×768. A atualização não apaga, recria nem substitui bancos existentes.</w:t>
       </w:r>
     </w:p>
     <w:sectPr>

</xml_diff>

<commit_message>
feat: revisar informe fiscal e qualidade geral
</commit_message>
<xml_diff>
--- a/DOCUMENTAÇÃO DO SISTEMA CONTROLE FINANCEIRO.docx
+++ b/DOCUMENTAÇÃO DO SISTEMA CONTROLE FINANCEIRO.docx
@@ -35,7 +35,7 @@
         <w:t xml:space="preserve"> </w:t>
       </w:r>
       <w:r>
-        <w:t xml:space="preserve">2.1.0-test.12</w:t>
+        <w:t xml:space="preserve">2.1.0-test.13</w:t>
       </w:r>
       <w:r>
         <w:t xml:space="preserve"> </w:t>
@@ -92,7 +92,7 @@
           <w:rPr>
             <w:rStyle w:val="Hyperlink"/>
           </w:rPr>
-          <w:t xml:space="preserve">https://github.com/boente66/Finance_Assist/releases/tag/v2.1.0-test.12</w:t>
+          <w:t xml:space="preserve">https://github.com/boente66/Finance_Assist/releases/tag/v2.1.0-test.13</w:t>
         </w:r>
       </w:hyperlink>
     </w:p>
@@ -1137,7 +1137,7 @@
         <w:pStyle w:val="Compact"/>
       </w:pPr>
       <w:r>
-        <w:t xml:space="preserve">Baixe finance-assist_2.1.0-test.12_windows-x64.zip.</w:t>
+        <w:t xml:space="preserve">Baixe finance-assist_2.1.0-test.13_windows-x64.zip.</w:t>
       </w:r>
     </w:p>
     <w:p>
@@ -1190,7 +1190,7 @@
         <w:rPr>
           <w:rStyle w:val="VerbatimChar"/>
         </w:rPr>
-        <w:t xml:space="preserve">sudo apt install ./finance-assist_2.1.0-test.12_amd64.deb</w:t>
+        <w:t xml:space="preserve">sudo apt install ./finance-assist_2.1.0-test.13_amd64.deb</w:t>
       </w:r>
     </w:p>
     <w:p>
@@ -1503,7 +1503,7 @@
           <w:rPr>
             <w:rStyle w:val="Hyperlink"/>
           </w:rPr>
-          <w:t xml:space="preserve">https://github.com/boente66/Finance_Assist/releases/tag/v2.1.0-test.12</w:t>
+          <w:t xml:space="preserve">https://github.com/boente66/Finance_Assist/releases/tag/v2.1.0-test.13</w:t>
         </w:r>
       </w:hyperlink>
     </w:p>
@@ -1535,7 +1535,7 @@
         <w:pStyle w:val="FirstParagraph"/>
       </w:pPr>
       <w:r>
-        <w:t xml:space="preserve">A versão 2.1.0-test.12 foi validada com 263 testes automatizados. Os instaladores</w:t>
+        <w:t xml:space="preserve">A versão 2.1.0-test.13 foi validada com 263 testes automatizados. Os instaladores</w:t>
       </w:r>
       <w:r>
         <w:t xml:space="preserve"> </w:t>
@@ -1551,7 +1551,7 @@
         <w:pStyle w:val="Heading1"/>
       </w:pPr>
       <w:r>
-        <w:t>Atualização 2.1.0-test.12 — visualização e orçamento mensal</w:t>
+        <w:t>Atualização 2.1.0-test.13 — visualização e orçamento mensal</w:t>
       </w:r>
     </w:p>
     <w:p>
@@ -1603,7 +1603,7 @@
         <w:pStyle w:val="Heading1"/>
       </w:pPr>
       <w:r>
-        <w:t>Atualização 2.1.0-test.12 — correções de interface e competências</w:t>
+        <w:t>Atualização 2.1.0-test.13 — correções de interface e competências</w:t>
       </w:r>
     </w:p>
     <w:p>
@@ -1648,6 +1648,61 @@
     <w:p>
       <w:r>
         <w:t>Foram validados 267 cenários automatizados e renderizações equivalentes a 1366×768. A atualização não apaga, recria nem substitui bancos existentes.</w:t>
+      </w:r>
+    </w:p>
+    <w:p>
+      <w:r>
+        <w:t xml:space="preserve">Informe fiscal por fonte pagadora — setembro de 2026</w:t>
+      </w:r>
+    </w:p>
+    <w:p>
+      <w:r>
+        <w:t xml:space="preserve">O Finance Assist separa o relatório financeiro auxiliar do modelo fiscal. O relatório auxiliar resume transações e não classifica tributação ou dedutibilidade.</w:t>
+      </w:r>
+    </w:p>
+    <w:p>
+      <w:r>
+        <w:t xml:space="preserve">Como usar:</w:t>
+      </w:r>
+    </w:p>
+    <w:p>
+      <w:r>
+        <w:t xml:space="preserve">1. Abra Relatórios e selecione Informe de Rendimentos.</w:t>
+      </w:r>
+    </w:p>
+    <w:p>
+      <w:r>
+        <w:t xml:space="preserve">2. Clique em Dados fiscais.</w:t>
+      </w:r>
+    </w:p>
+    <w:p>
+      <w:r>
+        <w:t xml:space="preserve">3. Transcreva ano, fonte pagadora, CPF/CNPJ, natureza e os valores do comprovante recebido.</w:t>
+      </w:r>
+    </w:p>
+    <w:p>
+      <w:r>
+        <w:t xml:space="preserve">4. Salve, escolha Modelo fiscal por fonte pagadora, selecione a fonte e visualize ou exporte o PDF.</w:t>
+      </w:r>
+    </w:p>
+    <w:p>
+      <w:r>
+        <w:t xml:space="preserve">5. Confira o resultado com o documento original antes de declarar.</w:t>
+      </w:r>
+    </w:p>
+    <w:p>
+      <w:r>
+        <w:t xml:space="preserve">Proteção dos dados existentes:</w:t>
+      </w:r>
+    </w:p>
+    <w:p>
+      <w:r>
+        <w:t xml:space="preserve">A atualização cria uma tabela adicional e preserva contas, transações, cartões, faturas, agendamentos, backups e usuários já existentes. Instale sobre a versão anterior e não apague o banco.</w:t>
+      </w:r>
+    </w:p>
+    <w:p>
+      <w:r>
+        <w:t xml:space="preserve">O aplicativo não calcula IRRF a partir do extrato e não substitui o comprovante emitido pela fonte pagadora. Os dados fiscais são transcritos pelo usuário e ficam separados por usuário, ano e fonte.</w:t>
       </w:r>
     </w:p>
     <w:sectPr>

</xml_diff>